<commit_message>
feat: integrar soporte para Oracle DB y mockup REST API de SIGED
</commit_message>
<xml_diff>
--- a/plantilla_base.docx
+++ b/plantilla_base.docx
@@ -9,7 +9,7 @@
       <w:r>
         <w:rPr>
           <w:b/>
-          <w:color w:val="0C4A6E"/>
+          <w:color w:val="0039AA"/>
           <w:sz w:val="26"/>
         </w:rPr>
         <w:t>OSINERGMIN</w:t>
@@ -31,7 +31,7 @@
       <w:r>
         <w:rPr>
           <w:b/>
-          <w:color w:val="0C4A6E"/>
+          <w:color w:val="0039AA"/>
           <w:sz w:val="24"/>
         </w:rPr>
         <w:t>CAPÍTULO I: DISPOSICIONES GENERALES Y DATOS DEL PROCESO</w:t>
@@ -232,7 +232,7 @@
       <w:r>
         <w:rPr>
           <w:b/>
-          <w:color w:val="0C4A6E"/>
+          <w:color w:val="0039AA"/>
           <w:sz w:val="24"/>
         </w:rPr>
         <w:t>CAPÍTULO II: CRONOGRAMA DEL PROCEDIMIENTO DE SELECCIÓN</w:t>
@@ -396,7 +396,7 @@
       <w:r>
         <w:rPr>
           <w:b/>
-          <w:color w:val="0C4A6E"/>
+          <w:color w:val="0039AA"/>
           <w:sz w:val="24"/>
         </w:rPr>
         <w:t>CAPÍTULO III: VALOR ESTIMADO Y CONDICIONES ECONÓMICAS</w:t>
@@ -425,7 +425,7 @@
       <w:r>
         <w:rPr>
           <w:b/>
-          <w:color w:val="0C4A6E"/>
+          <w:color w:val="0039AA"/>
           <w:sz w:val="24"/>
         </w:rPr>
         <w:t>CAPÍTULO IV: REQUERIMIENTOS TÉCNICOS MÍNIMOS (PLAZOS Y REQUISITOS)</w:t>
@@ -461,7 +461,7 @@
       <w:r>
         <w:rPr>
           <w:b/>
-          <w:color w:val="0C4A6E"/>
+          <w:color w:val="0039AA"/>
           <w:sz w:val="24"/>
         </w:rPr>
         <w:t>CAPÍTULO V: FACTORES DE EVALUACIÓN</w:t>

</xml_diff>